<commit_message>
Task 1 fixes: cleaning-run lineage, confidence interval, live record counts
- clean_project_signal.py: add CLEANING_VERSION, run timestamp, input
  SHA256 hash, and Run_Info/Sheet_Record_Counts sheets for reproducible
  lineage tracking.
- finalize_workbook.py: surface lineage + a Wilson-score 95% CI on the
  flagged-record rate (105/414, 25.4%, CI 21.4%-29.8%) on the README
  cover sheet.
- project_signal_dashboard.html: replace hardcoded RECORDS_PER_SHEET=45
  with live per-sheet counts embedded from the actual data (true count
  is 46/sheet, so the old constant was silently understating flag
  density on every sheet).
- Regenerated project_signal_cleaned.xlsx and the Task 1 docx report
  with the above changes applied.
</commit_message>
<xml_diff>
--- a/Project_Signal_Task1_Data_Quality_Report.docx
+++ b/Project_Signal_Task1_Data_Quality_Report.docx
@@ -230,6 +230,12 @@
           <w:bCs/>
         </w:rPr>
         <w:t xml:space="preserve">The data is NOT decision-ready in its raw form, but IS usable for analysis, dashboards and prototyping once passed through the documented cleaning process below — with the specific exceptions still open (see §6) excluded or routed to human review rather than trusted at face value.</w:t>
+      </w:r>
+    </w:p>
+    <w:p>
+      <w:pPr/>
+      <w:r>
+        <w:t>Statistical note: 105 of 414 raw records (25.4%) carry at least one detected exception flag. Treating this as a sample rate gives a 95% Wilson-score confidence interval of 21.4%–29.8% for the true flagged-record rate. This interval describes uncertainty in the *measured* rate given the sample size, not the probability that undetected issues remain outside the rule-set in §1 — those are two separate sources of uncertainty and only the first is quantified here.</w:t>
       </w:r>
     </w:p>
     <w:p>

</xml_diff>

<commit_message>
Fix #3: reconcile the two flagged-record percentages in the Task 1 report
The Executive Summary stated '105 of the 405 records (25.9%)' while the
Trustworthiness verdict's Statistical note stated '105 of 414 raw records
(25.4%)' with no explanation tying the two together — both numbers are
correct (405 = de-duplicated unique records, 414 = raw rows including one
duplicate per sheet) but read as a contradiction on a skim.

Both passages now state each other's basis explicitly and point to one
another, so the 25.9%/25.4% split reads as a documented raw-vs-deduplicated
distinction rather than an inconsistency. No underlying numbers changed.

Validated: unzip/edit/rezip via the docx skill, XSD-validated against the
original (0 paragraph count change), rendered to PDF and visually confirmed.
</commit_message>
<xml_diff>
--- a/Project_Signal_Task1_Data_Quality_Report.docx
+++ b/Project_Signal_Task1_Data_Quality_Report.docx
@@ -108,7 +108,7 @@
         <w:spacing w:after="160"/>
       </w:pPr>
       <w:r>
-        <w:t xml:space="preserve">A reproducible Python pipeline (scripts/clean_project_signal.py) was used to parse every field, standardise dates, equipment names, units and category labels, and flag every exception at the record level. It found 117 individual issues touching 105 of the 405 records (25.9%). No record was silently altered or deleted: every raw value is preserved alongside its cleaned counterpart, and every removed duplicate is kept in a separate audit sheet.</w:t>
+        <w:t xml:space="preserve">A reproducible Python pipeline (scripts/clean_project_signal.py) was used to parse every field, standardise dates, equipment names, units and category labels, and flag every exception at the record level. It found 117 individual issues touching 105 of the 405 de-duplicated unique records (25.9%) — equivalently, 105 of the 414 raw rows before duplicate removal (25.4%; see the Statistical note below, which uses this raw-row basis for the confidence interval). No record was silently altered or deleted: every raw value is preserved alongside its cleaned counterpart, and every removed duplicate is kept in a separate audit sheet.</w:t>
       </w:r>
     </w:p>
     <w:p>
@@ -235,7 +235,7 @@
     <w:p>
       <w:pPr/>
       <w:r>
-        <w:t>Statistical note: 105 of 414 raw records (25.4%) carry at least one detected exception flag. Treating this as a sample rate gives a 95% Wilson-score confidence interval of 21.4%–29.8% for the true flagged-record rate. This interval describes uncertainty in the *measured* rate given the sample size, not the probability that undetected issues remain outside the rule-set in §1 — those are two separate sources of uncertainty and only the first is quantified here.</w:t>
+        <w:t>Statistical note: the headline figure above (105 of 405 de-duplicated records, 25.9%) counts each unique record once; expressed instead over all 414 raw rows before duplicate removal, the same 105 flagged items give 25.4% — the raw-row basis is used below because it matches the sample size actually drawn from. Treating that 25.4% as a sample rate gives a 95% Wilson-score confidence interval of 21.4%–29.8% for the true flagged-record rate. This interval describes uncertainty in the *measured* rate given the sample size, not the probability that undetected issues remain outside the rule-set in §1 — those are two separate sources of uncertainty and only the first is quantified here.</w:t>
       </w:r>
     </w:p>
     <w:p>

</xml_diff>